<commit_message>
Add plot applications (Παράρτημα 3) and decouple them from announcements.
The application form offers only active communities that have available plots,
labelled with the number of available plots. Applications no longer depend on
announcements: the submission-cycle check and the deadline criterion are removed.
Also includes the pending persons, announcement and plots work in the tree.

Co-Authored-By: Claude Sonnet 5.5 <noreply@anthropic.com>
</commit_message>
<xml_diff>
--- a/Στεγαστικό_Λευκωσίας_Codex (1)/stegastiko_nicosia/templates/notice.docx
+++ b/Στεγαστικό_Λευκωσίας_Codex (1)/stegastiko_nicosia/templates/notice.docx
@@ -9,7 +9,6 @@
           <w:rFonts w:ascii="Arial" w:hAnsi="Arial" w:cs="Arial"/>
           <w:b/>
           <w:bCs/>
-          <w:lang w:val="el-GR"/>
         </w:rPr>
       </w:pPr>
       <w:r>
@@ -29,19 +28,10 @@
       <w:r>
         <w:rPr>
           <w:rFonts w:ascii="Arial" w:hAnsi="Arial" w:cs="Arial"/>
-          <w:lang w:val="el-GR"/>
-        </w:rPr>
-        <w:t xml:space="preserve"> </w:t>
-      </w:r>
-      <w:r>
-        <w:rPr>
-          <w:rFonts w:ascii="Arial" w:hAnsi="Arial" w:cs="Arial"/>
           <w:b/>
           <w:bCs/>
-          <w:highlight w:val="yellow"/>
-          <w:lang w:val="el-GR"/>
-        </w:rPr>
-        <w:t>28 Σεπτεμβρίου, 2026</w:t>
+        </w:rPr>
+        <w:t>&lt;DATE_NOTICE&gt;</w:t>
       </w:r>
     </w:p>
     <w:p>
@@ -101,10 +91,28 @@
           <w:b/>
           <w:sz w:val="24"/>
           <w:szCs w:val="24"/>
-          <w:highlight w:val="yellow"/>
-          <w:lang w:val="el-GR"/>
-        </w:rPr>
-        <w:t>………………………………</w:t>
+          <w:lang w:val="el-GR"/>
+        </w:rPr>
+        <w:t>&lt;</w:t>
+      </w:r>
+      <w:r>
+        <w:rPr>
+          <w:rFonts w:ascii="Arial" w:hAnsi="Arial" w:cs="Arial"/>
+          <w:b/>
+          <w:sz w:val="24"/>
+          <w:szCs w:val="24"/>
+        </w:rPr>
+        <w:t>DISTINCT</w:t>
+      </w:r>
+      <w:r>
+        <w:rPr>
+          <w:rFonts w:ascii="Arial" w:hAnsi="Arial" w:cs="Arial"/>
+          <w:b/>
+          <w:sz w:val="24"/>
+          <w:szCs w:val="24"/>
+          <w:lang w:val="el-GR"/>
+        </w:rPr>
+        <w:t>&gt;</w:t>
       </w:r>
     </w:p>
     <w:p>
@@ -170,7 +178,6 @@
         </w:rPr>
         <w:t>E</w:t>
       </w:r>
-      <w:proofErr w:type="spellStart"/>
       <w:r>
         <w:rPr>
           <w:rFonts w:ascii="Arial" w:hAnsi="Arial" w:cs="Arial"/>
@@ -179,23 +186,13 @@
         </w:rPr>
         <w:t>παρχίας</w:t>
       </w:r>
-      <w:proofErr w:type="spellEnd"/>
-      <w:r>
-        <w:rPr>
-          <w:rFonts w:ascii="Arial" w:hAnsi="Arial" w:cs="Arial"/>
-          <w:b/>
-          <w:lang w:val="el-GR"/>
-        </w:rPr>
-        <w:t xml:space="preserve"> </w:t>
-      </w:r>
-      <w:r>
-        <w:rPr>
-          <w:rFonts w:ascii="Arial" w:hAnsi="Arial" w:cs="Arial"/>
-          <w:b/>
-          <w:highlight w:val="yellow"/>
-          <w:lang w:val="el-GR"/>
-        </w:rPr>
-        <w:t>………………………….</w:t>
+      <w:r>
+        <w:rPr>
+          <w:rFonts w:ascii="Arial" w:hAnsi="Arial" w:cs="Arial"/>
+          <w:b/>
+          <w:lang w:val="el-GR"/>
+        </w:rPr>
+        <w:t>&lt;DISTINCT&gt;</w:t>
       </w:r>
     </w:p>
     <w:p>
@@ -250,127 +247,144 @@
       <w:r>
         <w:rPr>
           <w:rFonts w:ascii="Arial" w:hAnsi="Arial" w:cs="Arial"/>
+          <w:lang w:val="el-GR"/>
+        </w:rPr>
+        <w:t xml:space="preserve"> </w:t>
+      </w:r>
+      <w:r>
+        <w:rPr>
+          <w:rFonts w:ascii="Arial" w:hAnsi="Arial" w:cs="Arial"/>
+          <w:lang w:val="el-GR"/>
+        </w:rPr>
+        <w:t>&lt;DISTINCT&gt;</w:t>
+      </w:r>
+      <w:r>
+        <w:rPr>
+          <w:rFonts w:ascii="Arial" w:hAnsi="Arial" w:cs="Arial"/>
+          <w:lang w:val="el-GR"/>
+        </w:rPr>
+        <w:t xml:space="preserve"> ανακοινώνει την </w:t>
+      </w:r>
+      <w:r>
+        <w:rPr>
+          <w:rFonts w:ascii="Arial" w:hAnsi="Arial" w:cs="Arial"/>
+          <w:b/>
+          <w:lang w:val="el-GR"/>
+        </w:rPr>
+        <w:t>έναρξη</w:t>
+      </w:r>
+      <w:r>
+        <w:rPr>
+          <w:rFonts w:ascii="Arial" w:hAnsi="Arial" w:cs="Arial"/>
+          <w:b/>
+          <w:lang w:val="el-GR"/>
+        </w:rPr>
+        <w:t xml:space="preserve"> της διαδικασίας</w:t>
+      </w:r>
+      <w:r>
+        <w:rPr>
+          <w:rFonts w:ascii="Arial" w:hAnsi="Arial" w:cs="Arial"/>
+          <w:b/>
+          <w:lang w:val="el-GR"/>
+        </w:rPr>
+        <w:t xml:space="preserve"> υποβολής αιτήσεων</w:t>
+      </w:r>
+      <w:r>
+        <w:rPr>
+          <w:rFonts w:ascii="Arial" w:hAnsi="Arial" w:cs="Arial"/>
+          <w:lang w:val="el-GR"/>
+        </w:rPr>
+        <w:t xml:space="preserve"> από ενδιαφερομένους για παραχώρηση σε αυτούς </w:t>
+      </w:r>
+      <w:r>
+        <w:rPr>
+          <w:rFonts w:ascii="Arial" w:hAnsi="Arial" w:cs="Arial"/>
+          <w:lang w:val="el-GR"/>
+        </w:rPr>
+        <w:t>οικοπέδ</w:t>
+      </w:r>
+      <w:r>
+        <w:rPr>
+          <w:rFonts w:ascii="Arial" w:hAnsi="Arial" w:cs="Arial"/>
+          <w:lang w:val="el-GR"/>
+        </w:rPr>
+        <w:t>ου</w:t>
+      </w:r>
+      <w:r>
+        <w:rPr>
+          <w:rFonts w:ascii="Arial" w:hAnsi="Arial" w:cs="Arial"/>
+          <w:lang w:val="el-GR"/>
+        </w:rPr>
+        <w:t>,</w:t>
+      </w:r>
+      <w:r>
+        <w:rPr>
+          <w:rFonts w:ascii="Arial" w:hAnsi="Arial" w:cs="Arial"/>
+          <w:lang w:val="el-GR"/>
+        </w:rPr>
+        <w:t xml:space="preserve"> </w:t>
+      </w:r>
+      <w:r>
+        <w:rPr>
+          <w:rFonts w:ascii="Arial" w:hAnsi="Arial" w:cs="Arial"/>
+          <w:lang w:val="el-GR"/>
+        </w:rPr>
+        <w:t xml:space="preserve">στο πλαίσιο του πιο πάνω Σχεδίου, </w:t>
+      </w:r>
+      <w:r>
+        <w:rPr>
+          <w:rFonts w:ascii="Arial" w:hAnsi="Arial" w:cs="Arial"/>
+          <w:lang w:val="el-GR"/>
+        </w:rPr>
+        <w:t>σε</w:t>
+      </w:r>
+      <w:r>
+        <w:rPr>
+          <w:rFonts w:ascii="Arial" w:hAnsi="Arial" w:cs="Arial"/>
+          <w:lang w:val="el-GR"/>
+        </w:rPr>
+        <w:t xml:space="preserve"> κοινότητες της </w:t>
+      </w:r>
+      <w:r>
+        <w:rPr>
+          <w:rFonts w:ascii="Arial" w:hAnsi="Arial" w:cs="Arial"/>
+        </w:rPr>
+        <w:t>E</w:t>
+      </w:r>
+      <w:r>
+        <w:rPr>
+          <w:rFonts w:ascii="Arial" w:hAnsi="Arial" w:cs="Arial"/>
+          <w:lang w:val="el-GR"/>
+        </w:rPr>
+        <w:t>παρχίας</w:t>
+      </w:r>
+      <w:r>
+        <w:rPr>
+          <w:rFonts w:ascii="Arial" w:hAnsi="Arial" w:cs="Arial"/>
+          <w:lang w:val="el-GR"/>
+        </w:rPr>
+        <w:t xml:space="preserve"> &lt;</w:t>
+      </w:r>
+      <w:r>
+        <w:rPr>
+          <w:rFonts w:ascii="Arial" w:hAnsi="Arial" w:cs="Arial"/>
+        </w:rPr>
+        <w:t>DISTINCT</w:t>
+      </w:r>
+      <w:r>
+        <w:rPr>
+          <w:rFonts w:ascii="Arial" w:hAnsi="Arial" w:cs="Arial"/>
+          <w:lang w:val="el-GR"/>
+        </w:rPr>
+        <w:t>&gt;</w:t>
+      </w:r>
+      <w:r>
+        <w:rPr>
+          <w:rFonts w:ascii="Arial" w:hAnsi="Arial" w:cs="Arial"/>
           <w:highlight w:val="yellow"/>
           <w:lang w:val="el-GR"/>
         </w:rPr>
-        <w:t>………………..</w:t>
-      </w:r>
-      <w:r>
-        <w:rPr>
-          <w:rFonts w:ascii="Arial" w:hAnsi="Arial" w:cs="Arial"/>
-          <w:lang w:val="el-GR"/>
-        </w:rPr>
-        <w:t xml:space="preserve"> ανακοινώνει την </w:t>
-      </w:r>
-      <w:r>
-        <w:rPr>
-          <w:rFonts w:ascii="Arial" w:hAnsi="Arial" w:cs="Arial"/>
-          <w:b/>
-          <w:lang w:val="el-GR"/>
-        </w:rPr>
-        <w:t>έναρξη</w:t>
-      </w:r>
-      <w:r>
-        <w:rPr>
-          <w:rFonts w:ascii="Arial" w:hAnsi="Arial" w:cs="Arial"/>
-          <w:b/>
-          <w:lang w:val="el-GR"/>
-        </w:rPr>
-        <w:t xml:space="preserve"> της διαδικασίας</w:t>
-      </w:r>
-      <w:r>
-        <w:rPr>
-          <w:rFonts w:ascii="Arial" w:hAnsi="Arial" w:cs="Arial"/>
-          <w:b/>
-          <w:lang w:val="el-GR"/>
-        </w:rPr>
-        <w:t xml:space="preserve"> υποβολής αιτήσεων</w:t>
-      </w:r>
-      <w:r>
-        <w:rPr>
-          <w:rFonts w:ascii="Arial" w:hAnsi="Arial" w:cs="Arial"/>
-          <w:lang w:val="el-GR"/>
-        </w:rPr>
-        <w:t xml:space="preserve"> από ενδιαφερομένους για παραχώρηση σε αυτούς </w:t>
-      </w:r>
-      <w:r>
-        <w:rPr>
-          <w:rFonts w:ascii="Arial" w:hAnsi="Arial" w:cs="Arial"/>
-          <w:lang w:val="el-GR"/>
-        </w:rPr>
-        <w:t>οικοπέδ</w:t>
-      </w:r>
-      <w:r>
-        <w:rPr>
-          <w:rFonts w:ascii="Arial" w:hAnsi="Arial" w:cs="Arial"/>
-          <w:lang w:val="el-GR"/>
-        </w:rPr>
-        <w:t>ου</w:t>
-      </w:r>
-      <w:r>
-        <w:rPr>
-          <w:rFonts w:ascii="Arial" w:hAnsi="Arial" w:cs="Arial"/>
-          <w:lang w:val="el-GR"/>
-        </w:rPr>
         <w:t>,</w:t>
-      </w:r>
-      <w:r>
-        <w:rPr>
-          <w:rFonts w:ascii="Arial" w:hAnsi="Arial" w:cs="Arial"/>
-          <w:lang w:val="el-GR"/>
-        </w:rPr>
-        <w:t xml:space="preserve"> </w:t>
-      </w:r>
-      <w:r>
-        <w:rPr>
-          <w:rFonts w:ascii="Arial" w:hAnsi="Arial" w:cs="Arial"/>
-          <w:lang w:val="el-GR"/>
-        </w:rPr>
-        <w:t xml:space="preserve">στο πλαίσιο του πιο πάνω Σχεδίου, </w:t>
-      </w:r>
-      <w:r>
-        <w:rPr>
-          <w:rFonts w:ascii="Arial" w:hAnsi="Arial" w:cs="Arial"/>
-          <w:lang w:val="el-GR"/>
-        </w:rPr>
-        <w:t>σε</w:t>
-      </w:r>
-      <w:r>
-        <w:rPr>
-          <w:rFonts w:ascii="Arial" w:hAnsi="Arial" w:cs="Arial"/>
-          <w:lang w:val="el-GR"/>
-        </w:rPr>
-        <w:t xml:space="preserve"> κοινότητες της </w:t>
-      </w:r>
-      <w:r>
-        <w:rPr>
-          <w:rFonts w:ascii="Arial" w:hAnsi="Arial" w:cs="Arial"/>
-        </w:rPr>
-        <w:t>E</w:t>
-      </w:r>
-      <w:proofErr w:type="spellStart"/>
-      <w:r>
-        <w:rPr>
-          <w:rFonts w:ascii="Arial" w:hAnsi="Arial" w:cs="Arial"/>
-          <w:lang w:val="el-GR"/>
-        </w:rPr>
-        <w:t>παρχίας</w:t>
-      </w:r>
-      <w:proofErr w:type="spellEnd"/>
-      <w:r>
-        <w:rPr>
-          <w:rFonts w:ascii="Arial" w:hAnsi="Arial" w:cs="Arial"/>
-          <w:lang w:val="el-GR"/>
-        </w:rPr>
-        <w:t xml:space="preserve"> </w:t>
-      </w:r>
-      <w:r>
-        <w:rPr>
-          <w:rFonts w:ascii="Arial" w:hAnsi="Arial" w:cs="Arial"/>
-          <w:highlight w:val="yellow"/>
-          <w:lang w:val="el-GR"/>
-        </w:rPr>
-        <w:t>…………….,</w:t>
       </w:r>
       <w:r>
         <w:rPr>
@@ -885,7 +899,6 @@
         </w:rPr>
         <w:t xml:space="preserve">οινότητες που εμπίπτουν στο όριο της απόστασης των 15 </w:t>
       </w:r>
-      <w:proofErr w:type="spellStart"/>
       <w:r>
         <w:rPr>
           <w:rFonts w:ascii="Arial" w:hAnsi="Arial" w:cs="Arial"/>
@@ -894,7 +907,6 @@
         </w:rPr>
         <w:t>χμ</w:t>
       </w:r>
-      <w:proofErr w:type="spellEnd"/>
       <w:r>
         <w:rPr>
           <w:rFonts w:ascii="Arial" w:hAnsi="Arial" w:cs="Arial"/>
@@ -1233,55 +1245,7 @@
           <w:rFonts w:ascii="Arial" w:hAnsi="Arial" w:cs="Arial"/>
           <w:lang w:val="el-GR"/>
         </w:rPr>
-        <w:t xml:space="preserve"> από τον </w:t>
-      </w:r>
-      <w:proofErr w:type="spellStart"/>
-      <w:r>
-        <w:rPr>
-          <w:rFonts w:ascii="Arial" w:hAnsi="Arial" w:cs="Arial"/>
-          <w:lang w:val="el-GR"/>
-        </w:rPr>
-        <w:t>Αιτητή</w:t>
-      </w:r>
-      <w:proofErr w:type="spellEnd"/>
-      <w:r>
-        <w:rPr>
-          <w:rFonts w:ascii="Arial" w:hAnsi="Arial" w:cs="Arial"/>
-          <w:lang w:val="el-GR"/>
-        </w:rPr>
-        <w:t>/</w:t>
-      </w:r>
-      <w:proofErr w:type="spellStart"/>
-      <w:r>
-        <w:rPr>
-          <w:rFonts w:ascii="Arial" w:hAnsi="Arial" w:cs="Arial"/>
-          <w:lang w:val="el-GR"/>
-        </w:rPr>
-        <w:t>Αιτήτρια</w:t>
-      </w:r>
-      <w:proofErr w:type="spellEnd"/>
-      <w:r>
-        <w:rPr>
-          <w:rFonts w:ascii="Arial" w:hAnsi="Arial" w:cs="Arial"/>
-          <w:lang w:val="el-GR"/>
-        </w:rPr>
-        <w:t xml:space="preserve"> (ή σύζυγο/</w:t>
-      </w:r>
-      <w:proofErr w:type="spellStart"/>
-      <w:r>
-        <w:rPr>
-          <w:rFonts w:ascii="Arial" w:hAnsi="Arial" w:cs="Arial"/>
-          <w:lang w:val="el-GR"/>
-        </w:rPr>
-        <w:t>συμβίο</w:t>
-      </w:r>
-      <w:proofErr w:type="spellEnd"/>
-      <w:r>
-        <w:rPr>
-          <w:rFonts w:ascii="Arial" w:hAnsi="Arial" w:cs="Arial"/>
-          <w:lang w:val="el-GR"/>
-        </w:rPr>
-        <w:t xml:space="preserve"> στην περίπτωση </w:t>
+        <w:t xml:space="preserve"> από τον Αιτητή/Αιτήτρια (ή σύζυγο/συμβίο στην περίπτωση </w:t>
       </w:r>
       <w:r>
         <w:rPr>
@@ -1632,33 +1596,15 @@
           <w:rFonts w:ascii="Arial" w:hAnsi="Arial" w:cs="Arial"/>
           <w:lang w:val="el-GR"/>
         </w:rPr>
-        <w:t xml:space="preserve"> </w:t>
-      </w:r>
-      <w:proofErr w:type="spellStart"/>
-      <w:r>
-        <w:rPr>
-          <w:rFonts w:ascii="Arial" w:hAnsi="Arial" w:cs="Arial"/>
-          <w:lang w:val="el-GR"/>
-        </w:rPr>
-        <w:t>Αιτητής</w:t>
-      </w:r>
-      <w:proofErr w:type="spellEnd"/>
-      <w:r>
-        <w:rPr>
-          <w:rFonts w:ascii="Arial" w:hAnsi="Arial" w:cs="Arial"/>
-          <w:lang w:val="el-GR"/>
-        </w:rPr>
-        <w:t>/</w:t>
-      </w:r>
-      <w:proofErr w:type="spellStart"/>
-      <w:r>
-        <w:rPr>
-          <w:rFonts w:ascii="Arial" w:hAnsi="Arial" w:cs="Arial"/>
-          <w:lang w:val="el-GR"/>
-        </w:rPr>
-        <w:t>Αιτήτρια</w:t>
-      </w:r>
-      <w:proofErr w:type="spellEnd"/>
+        <w:t xml:space="preserve"> Αιτητής</w:t>
+      </w:r>
+      <w:r>
+        <w:rPr>
+          <w:rFonts w:ascii="Arial" w:hAnsi="Arial" w:cs="Arial"/>
+          <w:lang w:val="el-GR"/>
+        </w:rPr>
+        <w:t>/Αιτήτρια</w:t>
+      </w:r>
       <w:r>
         <w:rPr>
           <w:rFonts w:ascii="Arial" w:hAnsi="Arial" w:cs="Arial"/>
@@ -1736,23 +1682,7 @@
           <w:rFonts w:ascii="Arial" w:hAnsi="Arial" w:cs="Arial"/>
           <w:lang w:val="el-GR"/>
         </w:rPr>
-        <w:t xml:space="preserve"> στη βάση των καθορισμένων κριτηρίων </w:t>
-      </w:r>
-      <w:proofErr w:type="spellStart"/>
-      <w:r>
-        <w:rPr>
-          <w:rFonts w:ascii="Arial" w:hAnsi="Arial" w:cs="Arial"/>
-          <w:lang w:val="el-GR"/>
-        </w:rPr>
-        <w:t>επιλεξιμότητας</w:t>
-      </w:r>
-      <w:proofErr w:type="spellEnd"/>
-      <w:r>
-        <w:rPr>
-          <w:rFonts w:ascii="Arial" w:hAnsi="Arial" w:cs="Arial"/>
-          <w:lang w:val="el-GR"/>
-        </w:rPr>
-        <w:t xml:space="preserve"> και </w:t>
+        <w:t xml:space="preserve"> στη βάση των καθορισμένων κριτηρίων επιλεξιμότητας και </w:t>
       </w:r>
       <w:r>
         <w:rPr>
@@ -1766,17 +1696,8 @@
           <w:rFonts w:ascii="Arial" w:hAnsi="Arial" w:cs="Arial"/>
           <w:lang w:val="el-GR"/>
         </w:rPr>
-        <w:t xml:space="preserve">κριτηρίων </w:t>
-      </w:r>
-      <w:proofErr w:type="spellStart"/>
-      <w:r>
-        <w:rPr>
-          <w:rFonts w:ascii="Arial" w:hAnsi="Arial" w:cs="Arial"/>
-          <w:lang w:val="el-GR"/>
-        </w:rPr>
-        <w:t>προτεραιοποίησης</w:t>
-      </w:r>
-      <w:proofErr w:type="spellEnd"/>
+        <w:t>κριτηρίων προτεραιοποίησης</w:t>
+      </w:r>
       <w:r>
         <w:rPr>
           <w:rFonts w:ascii="Arial" w:hAnsi="Arial" w:cs="Arial"/>
@@ -1861,7 +1782,6 @@
         </w:rPr>
         <w:t xml:space="preserve"> </w:t>
       </w:r>
-      <w:proofErr w:type="spellStart"/>
       <w:r>
         <w:rPr>
           <w:rFonts w:ascii="Arial" w:hAnsi="Arial" w:cs="Arial"/>
@@ -1876,23 +1796,13 @@
         </w:rPr>
         <w:t>ιτητή</w:t>
       </w:r>
-      <w:proofErr w:type="spellEnd"/>
-      <w:r>
-        <w:rPr>
-          <w:rFonts w:ascii="Arial" w:hAnsi="Arial" w:cs="Arial"/>
-          <w:lang w:val="el-GR"/>
-        </w:rPr>
-        <w:t>/</w:t>
-      </w:r>
-      <w:proofErr w:type="spellStart"/>
-      <w:r>
-        <w:rPr>
-          <w:rFonts w:ascii="Arial" w:hAnsi="Arial" w:cs="Arial"/>
-          <w:lang w:val="el-GR"/>
-        </w:rPr>
-        <w:t>Αιτήτριας</w:t>
-      </w:r>
-      <w:proofErr w:type="spellEnd"/>
+      <w:r>
+        <w:rPr>
+          <w:rFonts w:ascii="Arial" w:hAnsi="Arial" w:cs="Arial"/>
+          <w:lang w:val="el-GR"/>
+        </w:rPr>
+        <w:t>/Αιτήτριας</w:t>
+      </w:r>
       <w:r>
         <w:rPr>
           <w:rFonts w:ascii="Arial" w:hAnsi="Arial" w:cs="Arial"/>
@@ -2256,6 +2166,9 @@
     </w:p>
     <w:sectPr>
       <w:headerReference w:type="default" r:id="rId7"/>
+      <w:footerReference w:type="even" r:id="rId8"/>
+      <w:footerReference w:type="default" r:id="rId9"/>
+      <w:footerReference w:type="first" r:id="rId10"/>
       <w:pgSz w:w="12240" w:h="15840"/>
       <w:pgMar w:top="1440" w:right="1440" w:bottom="1135" w:left="1440" w:header="720" w:footer="720" w:gutter="0"/>
       <w:cols w:space="720"/>
@@ -2288,6 +2201,399 @@
     </w:p>
   </w:endnote>
 </w:endnotes>
+</file>
+
+<file path=word/footer1.xml><?xml version="1.0" encoding="utf-8"?>
+<w:ftr xmlns:wpc="http://schemas.microsoft.com/office/word/2010/wordprocessingCanvas" xmlns:cx="http://schemas.microsoft.com/office/drawing/2014/chartex" xmlns:cx1="http://schemas.microsoft.com/office/drawing/2015/9/8/chartex" xmlns:cx2="http://schemas.microsoft.com/office/drawing/2015/10/21/chartex" xmlns:cx3="http://schemas.microsoft.com/office/drawing/2016/5/9/chartex" xmlns:cx4="http://schemas.microsoft.com/office/drawing/2016/5/10/chartex" xmlns:cx5="http://schemas.microsoft.com/office/drawing/2016/5/11/chartex" xmlns:cx6="http://schemas.microsoft.com/office/drawing/2016/5/12/chartex" xmlns:cx7="http://schemas.microsoft.com/office/drawing/2016/5/13/chartex" xmlns:cx8="http://schemas.microsoft.com/office/drawing/2016/5/14/chartex" xmlns:mc="http://schemas.openxmlformats.org/markup-compatibility/2006" xmlns:aink="http://schemas.microsoft.com/office/drawing/2016/ink" xmlns:am3d="http://schemas.microsoft.com/office/drawing/2017/model3d" xmlns:o="urn:schemas-microsoft-com:office:office" xmlns:oel="http://schemas.microsoft.com/office/2019/extlst" xmlns:r="http://schemas.openxmlformats.org/officeDocument/2006/relationships" xmlns:m="http://schemas.openxmlformats.org/officeDocument/2006/math" xmlns:v="urn:schemas-microsoft-com:vml" xmlns:wp14="http://schemas.microsoft.com/office/word/2010/wordprocessingDrawing" xmlns:wp="http://schemas.openxmlformats.org/drawingml/2006/wordprocessingDrawing" xmlns:w10="urn:schemas-microsoft-com:office:word" xmlns:w="http://schemas.openxmlformats.org/wordprocessingml/2006/main" xmlns:w14="http://schemas.microsoft.com/office/word/2010/wordml" xmlns:w15="http://schemas.microsoft.com/office/word/2012/wordml" xmlns:w16cex="http://schemas.microsoft.com/office/word/2018/wordml/cex" xmlns:w16cid="http://schemas.microsoft.com/office/word/2016/wordml/cid" xmlns:w16="http://schemas.microsoft.com/office/word/2018/wordml" xmlns:w16du="http://schemas.microsoft.com/office/word/2023/wordml/word16du" xmlns:w16sdtdh="http://schemas.microsoft.com/office/word/2020/wordml/sdtdatahash" xmlns:w16sdtfl="http://schemas.microsoft.com/office/word/2024/wordml/sdtformatlock" xmlns:w16se="http://schemas.microsoft.com/office/word/2015/wordml/symex" xmlns:wpg="http://schemas.microsoft.com/office/word/2010/wordprocessingGroup" xmlns:wpi="http://schemas.microsoft.com/office/word/2010/wordprocessingInk" xmlns:wne="http://schemas.microsoft.com/office/word/2006/wordml" xmlns:wps="http://schemas.microsoft.com/office/word/2010/wordprocessingShape" mc:Ignorable="w14 w15 w16se w16cid w16 w16cex w16sdtdh w16sdtfl w16du wp14">
+  <w:p>
+    <w:pPr>
+      <w:pStyle w:val="Footer"/>
+    </w:pPr>
+    <w:r>
+      <w:rPr>
+        <w:noProof/>
+      </w:rPr>
+      <mc:AlternateContent>
+        <mc:Choice Requires="wps">
+          <w:drawing>
+            <wp:anchor distT="0" distB="0" distL="0" distR="0" simplePos="0" relativeHeight="251659264" behindDoc="0" locked="0" layoutInCell="1" allowOverlap="1" wp14:anchorId="65D53FFD" wp14:editId="5506EC7E">
+              <wp:simplePos x="635" y="635"/>
+              <wp:positionH relativeFrom="page">
+                <wp:align>left</wp:align>
+              </wp:positionH>
+              <wp:positionV relativeFrom="page">
+                <wp:align>bottom</wp:align>
+              </wp:positionV>
+              <wp:extent cx="1089660" cy="324485"/>
+              <wp:effectExtent l="0" t="0" r="15240" b="0"/>
+              <wp:wrapNone/>
+              <wp:docPr id="881545956" name="Text Box 2" descr="Sensitivity: Internal">
+                <a:extLst xmlns:a="http://schemas.openxmlformats.org/drawingml/2006/main">
+                  <a:ext uri="{5AE41FA2-C0FF-4470-9BD4-5FADCA87CBE2}">
+                    <aclsh:classification xmlns:aclsh="http://schemas.microsoft.com/office/drawing/2020/classificationShape" classificationOutcomeType="ftr"/>
+                  </a:ext>
+                </a:extLst>
+              </wp:docPr>
+              <wp:cNvGraphicFramePr/>
+              <a:graphic xmlns:a="http://schemas.openxmlformats.org/drawingml/2006/main">
+                <a:graphicData uri="http://schemas.microsoft.com/office/word/2010/wordprocessingShape">
+                  <wps:wsp>
+                    <wps:cNvSpPr txBox="1"/>
+                    <wps:spPr>
+                      <a:xfrm>
+                        <a:off x="0" y="0"/>
+                        <a:ext cx="1089660" cy="324485"/>
+                      </a:xfrm>
+                      <a:prstGeom prst="rect">
+                        <a:avLst/>
+                      </a:prstGeom>
+                      <a:noFill/>
+                      <a:ln>
+                        <a:noFill/>
+                      </a:ln>
+                    </wps:spPr>
+                    <wps:txbx>
+                      <w:txbxContent>
+                        <w:p>
+                          <w:pPr>
+                            <w:spacing w:after="0"/>
+                            <w:rPr>
+                              <w:rFonts w:ascii="Aptos" w:eastAsia="Aptos" w:hAnsi="Aptos" w:cs="Aptos"/>
+                              <w:noProof/>
+                              <w:color w:val="000000"/>
+                              <w:sz w:val="16"/>
+                              <w:szCs w:val="16"/>
+                            </w:rPr>
+                          </w:pPr>
+                          <w:r>
+                            <w:rPr>
+                              <w:rFonts w:ascii="Aptos" w:eastAsia="Aptos" w:hAnsi="Aptos" w:cs="Aptos"/>
+                              <w:noProof/>
+                              <w:color w:val="000000"/>
+                              <w:sz w:val="16"/>
+                              <w:szCs w:val="16"/>
+                            </w:rPr>
+                            <w:t>Sensitivity: Internal</w:t>
+                          </w:r>
+                        </w:p>
+                      </w:txbxContent>
+                    </wps:txbx>
+                    <wps:bodyPr rot="0" spcFirstLastPara="0" vertOverflow="overflow" horzOverflow="overflow" vert="horz" wrap="none" lIns="254000" tIns="0" rIns="0" bIns="190500" numCol="1" spcCol="0" rtlCol="0" fromWordArt="0" anchor="b" anchorCtr="0" forceAA="0" compatLnSpc="1">
+                      <a:prstTxWarp prst="textNoShape">
+                        <a:avLst/>
+                      </a:prstTxWarp>
+                      <a:spAutoFit/>
+                    </wps:bodyPr>
+                  </wps:wsp>
+                </a:graphicData>
+              </a:graphic>
+            </wp:anchor>
+          </w:drawing>
+        </mc:Choice>
+        <mc:Fallback>
+          <w:pict>
+            <v:shapetype w14:anchorId="65D53FFD" id="_x0000_t202" coordsize="21600,21600" o:spt="202" path="m,l,21600r21600,l21600,xe">
+              <v:stroke joinstyle="miter"/>
+              <v:path gradientshapeok="t" o:connecttype="rect"/>
+            </v:shapetype>
+            <v:shape id="Text Box 2" o:spid="_x0000_s1026" type="#_x0000_t202" alt="Sensitivity: Internal" style="position:absolute;margin-left:0;margin-top:0;width:85.8pt;height:25.55pt;z-index:251659264;visibility:visible;mso-wrap-style:none;mso-wrap-distance-left:0;mso-wrap-distance-top:0;mso-wrap-distance-right:0;mso-wrap-distance-bottom:0;mso-position-horizontal:left;mso-position-horizontal-relative:page;mso-position-vertical:bottom;mso-position-vertical-relative:page;v-text-anchor:bottom" o:gfxdata="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" filled="f" stroked="f">
+              <v:fill o:detectmouseclick="t"/>
+              <v:textbox style="mso-fit-shape-to-text:t" inset="20pt,0,0,15pt">
+                <w:txbxContent>
+                  <w:p>
+                    <w:pPr>
+                      <w:spacing w:after="0"/>
+                      <w:rPr>
+                        <w:rFonts w:ascii="Aptos" w:eastAsia="Aptos" w:hAnsi="Aptos" w:cs="Aptos"/>
+                        <w:noProof/>
+                        <w:color w:val="000000"/>
+                        <w:sz w:val="16"/>
+                        <w:szCs w:val="16"/>
+                      </w:rPr>
+                    </w:pPr>
+                    <w:r>
+                      <w:rPr>
+                        <w:rFonts w:ascii="Aptos" w:eastAsia="Aptos" w:hAnsi="Aptos" w:cs="Aptos"/>
+                        <w:noProof/>
+                        <w:color w:val="000000"/>
+                        <w:sz w:val="16"/>
+                        <w:szCs w:val="16"/>
+                      </w:rPr>
+                      <w:t>Sensitivity: Internal</w:t>
+                    </w:r>
+                  </w:p>
+                </w:txbxContent>
+              </v:textbox>
+              <w10:wrap anchorx="page" anchory="page"/>
+            </v:shape>
+          </w:pict>
+        </mc:Fallback>
+      </mc:AlternateContent>
+    </w:r>
+  </w:p>
+</w:ftr>
+</file>
+
+<file path=word/footer2.xml><?xml version="1.0" encoding="utf-8"?>
+<w:ftr xmlns:wpc="http://schemas.microsoft.com/office/word/2010/wordprocessingCanvas" xmlns:cx="http://schemas.microsoft.com/office/drawing/2014/chartex" xmlns:cx1="http://schemas.microsoft.com/office/drawing/2015/9/8/chartex" xmlns:cx2="http://schemas.microsoft.com/office/drawing/2015/10/21/chartex" xmlns:cx3="http://schemas.microsoft.com/office/drawing/2016/5/9/chartex" xmlns:cx4="http://schemas.microsoft.com/office/drawing/2016/5/10/chartex" xmlns:cx5="http://schemas.microsoft.com/office/drawing/2016/5/11/chartex" xmlns:cx6="http://schemas.microsoft.com/office/drawing/2016/5/12/chartex" xmlns:cx7="http://schemas.microsoft.com/office/drawing/2016/5/13/chartex" xmlns:cx8="http://schemas.microsoft.com/office/drawing/2016/5/14/chartex" xmlns:mc="http://schemas.openxmlformats.org/markup-compatibility/2006" xmlns:aink="http://schemas.microsoft.com/office/drawing/2016/ink" xmlns:am3d="http://schemas.microsoft.com/office/drawing/2017/model3d" xmlns:o="urn:schemas-microsoft-com:office:office" xmlns:oel="http://schemas.microsoft.com/office/2019/extlst" xmlns:r="http://schemas.openxmlformats.org/officeDocument/2006/relationships" xmlns:m="http://schemas.openxmlformats.org/officeDocument/2006/math" xmlns:v="urn:schemas-microsoft-com:vml" xmlns:wp14="http://schemas.microsoft.com/office/word/2010/wordprocessingDrawing" xmlns:wp="http://schemas.openxmlformats.org/drawingml/2006/wordprocessingDrawing" xmlns:w10="urn:schemas-microsoft-com:office:word" xmlns:w="http://schemas.openxmlformats.org/wordprocessingml/2006/main" xmlns:w14="http://schemas.microsoft.com/office/word/2010/wordml" xmlns:w15="http://schemas.microsoft.com/office/word/2012/wordml" xmlns:w16cex="http://schemas.microsoft.com/office/word/2018/wordml/cex" xmlns:w16cid="http://schemas.microsoft.com/office/word/2016/wordml/cid" xmlns:w16="http://schemas.microsoft.com/office/word/2018/wordml" xmlns:w16du="http://schemas.microsoft.com/office/word/2023/wordml/word16du" xmlns:w16sdtdh="http://schemas.microsoft.com/office/word/2020/wordml/sdtdatahash" xmlns:w16sdtfl="http://schemas.microsoft.com/office/word/2024/wordml/sdtformatlock" xmlns:w16se="http://schemas.microsoft.com/office/word/2015/wordml/symex" xmlns:wpg="http://schemas.microsoft.com/office/word/2010/wordprocessingGroup" xmlns:wpi="http://schemas.microsoft.com/office/word/2010/wordprocessingInk" xmlns:wne="http://schemas.microsoft.com/office/word/2006/wordml" xmlns:wps="http://schemas.microsoft.com/office/word/2010/wordprocessingShape" mc:Ignorable="w14 w15 w16se w16cid w16 w16cex w16sdtdh w16sdtfl w16du wp14">
+  <w:p>
+    <w:pPr>
+      <w:pStyle w:val="Footer"/>
+    </w:pPr>
+    <w:r>
+      <w:rPr>
+        <w:noProof/>
+      </w:rPr>
+      <mc:AlternateContent>
+        <mc:Choice Requires="wps">
+          <w:drawing>
+            <wp:anchor distT="0" distB="0" distL="0" distR="0" simplePos="0" relativeHeight="251660288" behindDoc="0" locked="0" layoutInCell="1" allowOverlap="1" wp14:anchorId="78957F89" wp14:editId="78A70F66">
+              <wp:simplePos x="914400" y="9433560"/>
+              <wp:positionH relativeFrom="page">
+                <wp:align>left</wp:align>
+              </wp:positionH>
+              <wp:positionV relativeFrom="page">
+                <wp:align>bottom</wp:align>
+              </wp:positionV>
+              <wp:extent cx="1089660" cy="324485"/>
+              <wp:effectExtent l="0" t="0" r="15240" b="0"/>
+              <wp:wrapNone/>
+              <wp:docPr id="1562848896" name="Text Box 3" descr="Sensitivity: Internal">
+                <a:extLst xmlns:a="http://schemas.openxmlformats.org/drawingml/2006/main">
+                  <a:ext uri="{5AE41FA2-C0FF-4470-9BD4-5FADCA87CBE2}">
+                    <aclsh:classification xmlns:aclsh="http://schemas.microsoft.com/office/drawing/2020/classificationShape" classificationOutcomeType="ftr"/>
+                  </a:ext>
+                </a:extLst>
+              </wp:docPr>
+              <wp:cNvGraphicFramePr/>
+              <a:graphic xmlns:a="http://schemas.openxmlformats.org/drawingml/2006/main">
+                <a:graphicData uri="http://schemas.microsoft.com/office/word/2010/wordprocessingShape">
+                  <wps:wsp>
+                    <wps:cNvSpPr txBox="1"/>
+                    <wps:spPr>
+                      <a:xfrm>
+                        <a:off x="0" y="0"/>
+                        <a:ext cx="1089660" cy="324485"/>
+                      </a:xfrm>
+                      <a:prstGeom prst="rect">
+                        <a:avLst/>
+                      </a:prstGeom>
+                      <a:noFill/>
+                      <a:ln>
+                        <a:noFill/>
+                      </a:ln>
+                    </wps:spPr>
+                    <wps:txbx>
+                      <w:txbxContent>
+                        <w:p>
+                          <w:pPr>
+                            <w:spacing w:after="0"/>
+                            <w:rPr>
+                              <w:rFonts w:ascii="Aptos" w:eastAsia="Aptos" w:hAnsi="Aptos" w:cs="Aptos"/>
+                              <w:noProof/>
+                              <w:color w:val="000000"/>
+                              <w:sz w:val="16"/>
+                              <w:szCs w:val="16"/>
+                            </w:rPr>
+                          </w:pPr>
+                          <w:r>
+                            <w:rPr>
+                              <w:rFonts w:ascii="Aptos" w:eastAsia="Aptos" w:hAnsi="Aptos" w:cs="Aptos"/>
+                              <w:noProof/>
+                              <w:color w:val="000000"/>
+                              <w:sz w:val="16"/>
+                              <w:szCs w:val="16"/>
+                            </w:rPr>
+                            <w:t>Sensitivity: Internal</w:t>
+                          </w:r>
+                        </w:p>
+                      </w:txbxContent>
+                    </wps:txbx>
+                    <wps:bodyPr rot="0" spcFirstLastPara="0" vertOverflow="overflow" horzOverflow="overflow" vert="horz" wrap="none" lIns="254000" tIns="0" rIns="0" bIns="190500" numCol="1" spcCol="0" rtlCol="0" fromWordArt="0" anchor="b" anchorCtr="0" forceAA="0" compatLnSpc="1">
+                      <a:prstTxWarp prst="textNoShape">
+                        <a:avLst/>
+                      </a:prstTxWarp>
+                      <a:spAutoFit/>
+                    </wps:bodyPr>
+                  </wps:wsp>
+                </a:graphicData>
+              </a:graphic>
+            </wp:anchor>
+          </w:drawing>
+        </mc:Choice>
+        <mc:Fallback>
+          <w:pict>
+            <v:shapetype w14:anchorId="78957F89" id="_x0000_t202" coordsize="21600,21600" o:spt="202" path="m,l,21600r21600,l21600,xe">
+              <v:stroke joinstyle="miter"/>
+              <v:path gradientshapeok="t" o:connecttype="rect"/>
+            </v:shapetype>
+            <v:shape id="Text Box 3" o:spid="_x0000_s1027" type="#_x0000_t202" alt="Sensitivity: Internal" style="position:absolute;margin-left:0;margin-top:0;width:85.8pt;height:25.55pt;z-index:251660288;visibility:visible;mso-wrap-style:none;mso-wrap-distance-left:0;mso-wrap-distance-top:0;mso-wrap-distance-right:0;mso-wrap-distance-bottom:0;mso-position-horizontal:left;mso-position-horizontal-relative:page;mso-position-vertical:bottom;mso-position-vertical-relative:page;v-text-anchor:bottom" o:gfxdata="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" filled="f" stroked="f">
+              <v:fill o:detectmouseclick="t"/>
+              <v:textbox style="mso-fit-shape-to-text:t" inset="20pt,0,0,15pt">
+                <w:txbxContent>
+                  <w:p>
+                    <w:pPr>
+                      <w:spacing w:after="0"/>
+                      <w:rPr>
+                        <w:rFonts w:ascii="Aptos" w:eastAsia="Aptos" w:hAnsi="Aptos" w:cs="Aptos"/>
+                        <w:noProof/>
+                        <w:color w:val="000000"/>
+                        <w:sz w:val="16"/>
+                        <w:szCs w:val="16"/>
+                      </w:rPr>
+                    </w:pPr>
+                    <w:r>
+                      <w:rPr>
+                        <w:rFonts w:ascii="Aptos" w:eastAsia="Aptos" w:hAnsi="Aptos" w:cs="Aptos"/>
+                        <w:noProof/>
+                        <w:color w:val="000000"/>
+                        <w:sz w:val="16"/>
+                        <w:szCs w:val="16"/>
+                      </w:rPr>
+                      <w:t>Sensitivity: Internal</w:t>
+                    </w:r>
+                  </w:p>
+                </w:txbxContent>
+              </v:textbox>
+              <w10:wrap anchorx="page" anchory="page"/>
+            </v:shape>
+          </w:pict>
+        </mc:Fallback>
+      </mc:AlternateContent>
+    </w:r>
+  </w:p>
+</w:ftr>
+</file>
+
+<file path=word/footer3.xml><?xml version="1.0" encoding="utf-8"?>
+<w:ftr xmlns:wpc="http://schemas.microsoft.com/office/word/2010/wordprocessingCanvas" xmlns:cx="http://schemas.microsoft.com/office/drawing/2014/chartex" xmlns:cx1="http://schemas.microsoft.com/office/drawing/2015/9/8/chartex" xmlns:cx2="http://schemas.microsoft.com/office/drawing/2015/10/21/chartex" xmlns:cx3="http://schemas.microsoft.com/office/drawing/2016/5/9/chartex" xmlns:cx4="http://schemas.microsoft.com/office/drawing/2016/5/10/chartex" xmlns:cx5="http://schemas.microsoft.com/office/drawing/2016/5/11/chartex" xmlns:cx6="http://schemas.microsoft.com/office/drawing/2016/5/12/chartex" xmlns:cx7="http://schemas.microsoft.com/office/drawing/2016/5/13/chartex" xmlns:cx8="http://schemas.microsoft.com/office/drawing/2016/5/14/chartex" xmlns:mc="http://schemas.openxmlformats.org/markup-compatibility/2006" xmlns:aink="http://schemas.microsoft.com/office/drawing/2016/ink" xmlns:am3d="http://schemas.microsoft.com/office/drawing/2017/model3d" xmlns:o="urn:schemas-microsoft-com:office:office" xmlns:oel="http://schemas.microsoft.com/office/2019/extlst" xmlns:r="http://schemas.openxmlformats.org/officeDocument/2006/relationships" xmlns:m="http://schemas.openxmlformats.org/officeDocument/2006/math" xmlns:v="urn:schemas-microsoft-com:vml" xmlns:wp14="http://schemas.microsoft.com/office/word/2010/wordprocessingDrawing" xmlns:wp="http://schemas.openxmlformats.org/drawingml/2006/wordprocessingDrawing" xmlns:w10="urn:schemas-microsoft-com:office:word" xmlns:w="http://schemas.openxmlformats.org/wordprocessingml/2006/main" xmlns:w14="http://schemas.microsoft.com/office/word/2010/wordml" xmlns:w15="http://schemas.microsoft.com/office/word/2012/wordml" xmlns:w16cex="http://schemas.microsoft.com/office/word/2018/wordml/cex" xmlns:w16cid="http://schemas.microsoft.com/office/word/2016/wordml/cid" xmlns:w16="http://schemas.microsoft.com/office/word/2018/wordml" xmlns:w16du="http://schemas.microsoft.com/office/word/2023/wordml/word16du" xmlns:w16sdtdh="http://schemas.microsoft.com/office/word/2020/wordml/sdtdatahash" xmlns:w16sdtfl="http://schemas.microsoft.com/office/word/2024/wordml/sdtformatlock" xmlns:w16se="http://schemas.microsoft.com/office/word/2015/wordml/symex" xmlns:wpg="http://schemas.microsoft.com/office/word/2010/wordprocessingGroup" xmlns:wpi="http://schemas.microsoft.com/office/word/2010/wordprocessingInk" xmlns:wne="http://schemas.microsoft.com/office/word/2006/wordml" xmlns:wps="http://schemas.microsoft.com/office/word/2010/wordprocessingShape" mc:Ignorable="w14 w15 w16se w16cid w16 w16cex w16sdtdh w16sdtfl w16du wp14">
+  <w:p>
+    <w:pPr>
+      <w:pStyle w:val="Footer"/>
+    </w:pPr>
+    <w:r>
+      <w:rPr>
+        <w:noProof/>
+      </w:rPr>
+      <mc:AlternateContent>
+        <mc:Choice Requires="wps">
+          <w:drawing>
+            <wp:anchor distT="0" distB="0" distL="0" distR="0" simplePos="0" relativeHeight="251658240" behindDoc="0" locked="0" layoutInCell="1" allowOverlap="1" wp14:anchorId="0455B032" wp14:editId="44A56FA8">
+              <wp:simplePos x="635" y="635"/>
+              <wp:positionH relativeFrom="page">
+                <wp:align>left</wp:align>
+              </wp:positionH>
+              <wp:positionV relativeFrom="page">
+                <wp:align>bottom</wp:align>
+              </wp:positionV>
+              <wp:extent cx="1089660" cy="324485"/>
+              <wp:effectExtent l="0" t="0" r="15240" b="0"/>
+              <wp:wrapNone/>
+              <wp:docPr id="246496459" name="Text Box 1" descr="Sensitivity: Internal">
+                <a:extLst xmlns:a="http://schemas.openxmlformats.org/drawingml/2006/main">
+                  <a:ext uri="{5AE41FA2-C0FF-4470-9BD4-5FADCA87CBE2}">
+                    <aclsh:classification xmlns:aclsh="http://schemas.microsoft.com/office/drawing/2020/classificationShape" classificationOutcomeType="ftr"/>
+                  </a:ext>
+                </a:extLst>
+              </wp:docPr>
+              <wp:cNvGraphicFramePr/>
+              <a:graphic xmlns:a="http://schemas.openxmlformats.org/drawingml/2006/main">
+                <a:graphicData uri="http://schemas.microsoft.com/office/word/2010/wordprocessingShape">
+                  <wps:wsp>
+                    <wps:cNvSpPr txBox="1"/>
+                    <wps:spPr>
+                      <a:xfrm>
+                        <a:off x="0" y="0"/>
+                        <a:ext cx="1089660" cy="324485"/>
+                      </a:xfrm>
+                      <a:prstGeom prst="rect">
+                        <a:avLst/>
+                      </a:prstGeom>
+                      <a:noFill/>
+                      <a:ln>
+                        <a:noFill/>
+                      </a:ln>
+                    </wps:spPr>
+                    <wps:txbx>
+                      <w:txbxContent>
+                        <w:p>
+                          <w:pPr>
+                            <w:spacing w:after="0"/>
+                            <w:rPr>
+                              <w:rFonts w:ascii="Aptos" w:eastAsia="Aptos" w:hAnsi="Aptos" w:cs="Aptos"/>
+                              <w:noProof/>
+                              <w:color w:val="000000"/>
+                              <w:sz w:val="16"/>
+                              <w:szCs w:val="16"/>
+                            </w:rPr>
+                          </w:pPr>
+                          <w:r>
+                            <w:rPr>
+                              <w:rFonts w:ascii="Aptos" w:eastAsia="Aptos" w:hAnsi="Aptos" w:cs="Aptos"/>
+                              <w:noProof/>
+                              <w:color w:val="000000"/>
+                              <w:sz w:val="16"/>
+                              <w:szCs w:val="16"/>
+                            </w:rPr>
+                            <w:t>Sensitivity: Internal</w:t>
+                          </w:r>
+                        </w:p>
+                      </w:txbxContent>
+                    </wps:txbx>
+                    <wps:bodyPr rot="0" spcFirstLastPara="0" vertOverflow="overflow" horzOverflow="overflow" vert="horz" wrap="none" lIns="254000" tIns="0" rIns="0" bIns="190500" numCol="1" spcCol="0" rtlCol="0" fromWordArt="0" anchor="b" anchorCtr="0" forceAA="0" compatLnSpc="1">
+                      <a:prstTxWarp prst="textNoShape">
+                        <a:avLst/>
+                      </a:prstTxWarp>
+                      <a:spAutoFit/>
+                    </wps:bodyPr>
+                  </wps:wsp>
+                </a:graphicData>
+              </a:graphic>
+            </wp:anchor>
+          </w:drawing>
+        </mc:Choice>
+        <mc:Fallback>
+          <w:pict>
+            <v:shapetype w14:anchorId="0455B032" id="_x0000_t202" coordsize="21600,21600" o:spt="202" path="m,l,21600r21600,l21600,xe">
+              <v:stroke joinstyle="miter"/>
+              <v:path gradientshapeok="t" o:connecttype="rect"/>
+            </v:shapetype>
+            <v:shape id="Text Box 1" o:spid="_x0000_s1028" type="#_x0000_t202" alt="Sensitivity: Internal" style="position:absolute;margin-left:0;margin-top:0;width:85.8pt;height:25.55pt;z-index:251658240;visibility:visible;mso-wrap-style:none;mso-wrap-distance-left:0;mso-wrap-distance-top:0;mso-wrap-distance-right:0;mso-wrap-distance-bottom:0;mso-position-horizontal:left;mso-position-horizontal-relative:page;mso-position-vertical:bottom;mso-position-vertical-relative:page;v-text-anchor:bottom" o:gfxdata="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" filled="f" stroked="f">
+              <v:fill o:detectmouseclick="t"/>
+              <v:textbox style="mso-fit-shape-to-text:t" inset="20pt,0,0,15pt">
+                <w:txbxContent>
+                  <w:p>
+                    <w:pPr>
+                      <w:spacing w:after="0"/>
+                      <w:rPr>
+                        <w:rFonts w:ascii="Aptos" w:eastAsia="Aptos" w:hAnsi="Aptos" w:cs="Aptos"/>
+                        <w:noProof/>
+                        <w:color w:val="000000"/>
+                        <w:sz w:val="16"/>
+                        <w:szCs w:val="16"/>
+                      </w:rPr>
+                    </w:pPr>
+                    <w:r>
+                      <w:rPr>
+                        <w:rFonts w:ascii="Aptos" w:eastAsia="Aptos" w:hAnsi="Aptos" w:cs="Aptos"/>
+                        <w:noProof/>
+                        <w:color w:val="000000"/>
+                        <w:sz w:val="16"/>
+                        <w:szCs w:val="16"/>
+                      </w:rPr>
+                      <w:t>Sensitivity: Internal</w:t>
+                    </w:r>
+                  </w:p>
+                </w:txbxContent>
+              </v:textbox>
+              <w10:wrap anchorx="page" anchory="page"/>
+            </v:shape>
+          </w:pict>
+        </mc:Fallback>
+      </mc:AlternateContent>
+    </w:r>
+  </w:p>
+</w:ftr>
 </file>
 
 <file path=word/footnotes.xml><?xml version="1.0" encoding="utf-8"?>

</xml_diff>